<commit_message>
A seat can match on more than one address — Kennady would have been locked out
Her HQ seat was registered to a personal gmail address. Entra will present
kennadyn@sportpharm.com, findUserByEmail matched a single field, and the one
person unable to get in would have been the one who built it.

Seats now carry altEmails and matching is case-insensitive across all of
them, with a migration that tops up existing stores from the seed. Verified
both addresses reach the same owner seat before and after migration.

SETUP.md also now says what access she actually needs — Owner on the resource
group, Guest Inviter in Entra — rather than Global Administrator, and notes
Microsoft's guidance that a tenant wants two recovery accounts.

Co-Authored-By: Claude Opus 5 <noreply@anthropic.com>
</commit_message>
<xml_diff>
--- a/azure/SETUP.docx
+++ b/azure/SETUP.docx
@@ -2681,6 +2681,419 @@
           <w:szCs w:val="21"/>
         </w:rPr>
         <w:t xml:space="preserve"> is set separately, inside HQ, on its Team page — each person is assigned to a company there. A guest who has not been assigned one sees nothing at all, which is the safe direction to fail. Partner staff only ever see the orders addressed to their own company, and never drafts.</w:t>
+      </w:r>
+    </w:p>
+    <w:p>
+      <w:pPr>
+        <w:pStyle w:val="Heading2"/>
+        <w:spacing w:after="120" w:before="360"/>
+      </w:pPr>
+      <w:r>
+        <w:rPr>
+          <w:rFonts w:ascii="Calibri" w:cs="Calibri" w:eastAsia="Calibri" w:hAnsi="Calibri"/>
+          <w:b/>
+          <w:bCs/>
+          <w:caps w:val="false"/>
+          <w:color w:val="0F1D33"/>
+          <w:sz w:val="28"/>
+          <w:szCs w:val="28"/>
+        </w:rPr>
+        <w:t xml:space="preserve">5b · Access for Kennady — so she is not dependent on you afterwards</w:t>
+      </w:r>
+    </w:p>
+    <w:p>
+      <w:pPr>
+        <w:spacing w:after="80" w:before="80" w:line="300"/>
+      </w:pPr>
+      <w:r>
+        <w:rPr>
+          <w:rFonts w:ascii="Calibri" w:cs="Calibri" w:eastAsia="Calibri" w:hAnsi="Calibri"/>
+          <w:color w:val="15202B"/>
+          <w:sz w:val="21"/>
+          <w:szCs w:val="21"/>
+        </w:rPr>
+        <w:t xml:space="preserve">She does </w:t>
+      </w:r>
+      <w:r>
+        <w:rPr>
+          <w:rFonts w:ascii="Calibri" w:cs="Calibri" w:eastAsia="Calibri" w:hAnsi="Calibri"/>
+          <w:b/>
+          <w:bCs/>
+          <w:color w:val="0F1D33"/>
+          <w:sz w:val="21"/>
+          <w:szCs w:val="21"/>
+        </w:rPr>
+        <w:t xml:space="preserve">not</w:t>
+      </w:r>
+      <w:r>
+        <w:rPr>
+          <w:rFonts w:ascii="Calibri" w:cs="Calibri" w:eastAsia="Calibri" w:hAnsi="Calibri"/>
+          <w:color w:val="15202B"/>
+          <w:sz w:val="21"/>
+          <w:szCs w:val="21"/>
+        </w:rPr>
+        <w:t xml:space="preserve"> need Global Administrator. Two narrower things are enough, and both follow least privilege:</w:t>
+      </w:r>
+    </w:p>
+    <w:tbl>
+      <w:tblPr>
+        <w:tblW w:type="dxa" w:w="9792"/>
+        <w:tblBorders>
+          <w:top w:val="single" w:color="auto" w:sz="4"/>
+          <w:left w:val="single" w:color="auto" w:sz="4"/>
+          <w:bottom w:val="single" w:color="auto" w:sz="4"/>
+          <w:right w:val="single" w:color="auto" w:sz="4"/>
+          <w:insideH w:val="single" w:color="auto" w:sz="4"/>
+          <w:insideV w:val="single" w:color="auto" w:sz="4"/>
+        </w:tblBorders>
+      </w:tblPr>
+      <w:tblGrid>
+        <w:gridCol w:w="3264"/>
+        <w:gridCol w:w="3264"/>
+        <w:gridCol w:w="3264"/>
+      </w:tblGrid>
+      <w:tr>
+        <w:trPr>
+          <w:tblHeader/>
+        </w:trPr>
+        <w:tc>
+          <w:tcPr>
+            <w:tcW w:type="dxa" w:w="3264"/>
+            <w:shd w:fill="F1F3F5" w:val="clear"/>
+            <w:tcMar>
+              <w:top w:type="dxa" w:w="80"/>
+              <w:left w:type="dxa" w:w="110"/>
+              <w:bottom w:type="dxa" w:w="80"/>
+              <w:right w:type="dxa" w:w="110"/>
+            </w:tcMar>
+          </w:tcPr>
+          <w:p>
+            <w:pPr>
+              <w:spacing w:after="0" w:before="0"/>
+            </w:pPr>
+            <w:r>
+              <w:rPr>
+                <w:rFonts w:ascii="Calibri" w:cs="Calibri" w:eastAsia="Calibri" w:hAnsi="Calibri"/>
+                <w:b/>
+                <w:bCs/>
+                <w:color w:val="566371"/>
+                <w:sz w:val="18"/>
+                <w:szCs w:val="18"/>
+              </w:rPr>
+              <w:t xml:space="preserve">What</w:t>
+            </w:r>
+          </w:p>
+        </w:tc>
+        <w:tc>
+          <w:tcPr>
+            <w:tcW w:type="dxa" w:w="3264"/>
+            <w:shd w:fill="F1F3F5" w:val="clear"/>
+            <w:tcMar>
+              <w:top w:type="dxa" w:w="80"/>
+              <w:left w:type="dxa" w:w="110"/>
+              <w:bottom w:type="dxa" w:w="80"/>
+              <w:right w:type="dxa" w:w="110"/>
+            </w:tcMar>
+          </w:tcPr>
+          <w:p>
+            <w:pPr>
+              <w:spacing w:after="0" w:before="0"/>
+            </w:pPr>
+            <w:r>
+              <w:rPr>
+                <w:rFonts w:ascii="Calibri" w:cs="Calibri" w:eastAsia="Calibri" w:hAnsi="Calibri"/>
+                <w:b/>
+                <w:bCs/>
+                <w:color w:val="566371"/>
+                <w:sz w:val="18"/>
+                <w:szCs w:val="18"/>
+              </w:rPr>
+              <w:t xml:space="preserve">Role</w:t>
+            </w:r>
+          </w:p>
+        </w:tc>
+        <w:tc>
+          <w:tcPr>
+            <w:tcW w:type="dxa" w:w="3264"/>
+            <w:shd w:fill="F1F3F5" w:val="clear"/>
+            <w:tcMar>
+              <w:top w:type="dxa" w:w="80"/>
+              <w:left w:type="dxa" w:w="110"/>
+              <w:bottom w:type="dxa" w:w="80"/>
+              <w:right w:type="dxa" w:w="110"/>
+            </w:tcMar>
+          </w:tcPr>
+          <w:p>
+            <w:pPr>
+              <w:spacing w:after="0" w:before="0"/>
+            </w:pPr>
+            <w:r>
+              <w:rPr>
+                <w:rFonts w:ascii="Calibri" w:cs="Calibri" w:eastAsia="Calibri" w:hAnsi="Calibri"/>
+                <w:b/>
+                <w:bCs/>
+                <w:color w:val="566371"/>
+                <w:sz w:val="18"/>
+                <w:szCs w:val="18"/>
+              </w:rPr>
+              <w:t xml:space="preserve">Why</w:t>
+            </w:r>
+          </w:p>
+        </w:tc>
+      </w:tr>
+      <w:tr>
+        <w:tc>
+          <w:tcPr>
+            <w:tcW w:type="dxa" w:w="3264"/>
+            <w:tcMar>
+              <w:top w:type="dxa" w:w="80"/>
+              <w:left w:type="dxa" w:w="110"/>
+              <w:bottom w:type="dxa" w:w="80"/>
+              <w:right w:type="dxa" w:w="110"/>
+            </w:tcMar>
+          </w:tcPr>
+          <w:p>
+            <w:pPr>
+              <w:spacing w:after="0" w:before="0"/>
+            </w:pPr>
+            <w:r>
+              <w:rPr>
+                <w:rFonts w:ascii="Calibri" w:cs="Calibri" w:eastAsia="Calibri" w:hAnsi="Calibri"/>
+                <w:color w:val="15202B"/>
+                <w:sz w:val="21"/>
+                <w:szCs w:val="21"/>
+              </w:rPr>
+              <w:t xml:space="preserve">Manage the app in Azure</w:t>
+            </w:r>
+          </w:p>
+        </w:tc>
+        <w:tc>
+          <w:tcPr>
+            <w:tcW w:type="dxa" w:w="3264"/>
+            <w:tcMar>
+              <w:top w:type="dxa" w:w="80"/>
+              <w:left w:type="dxa" w:w="110"/>
+              <w:bottom w:type="dxa" w:w="80"/>
+              <w:right w:type="dxa" w:w="110"/>
+            </w:tcMar>
+          </w:tcPr>
+          <w:p>
+            <w:pPr>
+              <w:spacing w:after="0" w:before="0"/>
+            </w:pPr>
+            <w:r>
+              <w:rPr>
+                <w:rFonts w:ascii="Calibri" w:cs="Calibri" w:eastAsia="Calibri" w:hAnsi="Calibri"/>
+                <w:b/>
+                <w:bCs/>
+                <w:color w:val="0F1D33"/>
+                <w:sz w:val="21"/>
+                <w:szCs w:val="21"/>
+              </w:rPr>
+              <w:t xml:space="preserve">Owner</w:t>
+            </w:r>
+            <w:r>
+              <w:rPr>
+                <w:rFonts w:ascii="Calibri" w:cs="Calibri" w:eastAsia="Calibri" w:hAnsi="Calibri"/>
+                <w:color w:val="15202B"/>
+                <w:sz w:val="21"/>
+                <w:szCs w:val="21"/>
+              </w:rPr>
+              <w:t xml:space="preserve"> on the Static Web App's resource group</w:t>
+            </w:r>
+          </w:p>
+        </w:tc>
+        <w:tc>
+          <w:tcPr>
+            <w:tcW w:type="dxa" w:w="3264"/>
+            <w:tcMar>
+              <w:top w:type="dxa" w:w="80"/>
+              <w:left w:type="dxa" w:w="110"/>
+              <w:bottom w:type="dxa" w:w="80"/>
+              <w:right w:type="dxa" w:w="110"/>
+            </w:tcMar>
+          </w:tcPr>
+          <w:p>
+            <w:pPr>
+              <w:spacing w:after="0" w:before="0"/>
+            </w:pPr>
+            <w:r>
+              <w:rPr>
+                <w:rFonts w:ascii="Calibri" w:cs="Calibri" w:eastAsia="Calibri" w:hAnsi="Calibri"/>
+                <w:color w:val="15202B"/>
+                <w:sz w:val="21"/>
+                <w:szCs w:val="21"/>
+              </w:rPr>
+              <w:t xml:space="preserve">Change settings, read logs, redeploy without you</w:t>
+            </w:r>
+          </w:p>
+        </w:tc>
+      </w:tr>
+      <w:tr>
+        <w:tc>
+          <w:tcPr>
+            <w:tcW w:type="dxa" w:w="3264"/>
+            <w:tcMar>
+              <w:top w:type="dxa" w:w="80"/>
+              <w:left w:type="dxa" w:w="110"/>
+              <w:bottom w:type="dxa" w:w="80"/>
+              <w:right w:type="dxa" w:w="110"/>
+            </w:tcMar>
+          </w:tcPr>
+          <w:p>
+            <w:pPr>
+              <w:spacing w:after="0" w:before="0"/>
+            </w:pPr>
+            <w:r>
+              <w:rPr>
+                <w:rFonts w:ascii="Calibri" w:cs="Calibri" w:eastAsia="Calibri" w:hAnsi="Calibri"/>
+                <w:color w:val="15202B"/>
+                <w:sz w:val="21"/>
+                <w:szCs w:val="21"/>
+              </w:rPr>
+              <w:t xml:space="preserve">Invite partner staff</w:t>
+            </w:r>
+          </w:p>
+        </w:tc>
+        <w:tc>
+          <w:tcPr>
+            <w:tcW w:type="dxa" w:w="3264"/>
+            <w:tcMar>
+              <w:top w:type="dxa" w:w="80"/>
+              <w:left w:type="dxa" w:w="110"/>
+              <w:bottom w:type="dxa" w:w="80"/>
+              <w:right w:type="dxa" w:w="110"/>
+            </w:tcMar>
+          </w:tcPr>
+          <w:p>
+            <w:pPr>
+              <w:spacing w:after="0" w:before="0"/>
+            </w:pPr>
+            <w:r>
+              <w:rPr>
+                <w:rFonts w:ascii="Calibri" w:cs="Calibri" w:eastAsia="Calibri" w:hAnsi="Calibri"/>
+                <w:b/>
+                <w:bCs/>
+                <w:color w:val="0F1D33"/>
+                <w:sz w:val="21"/>
+                <w:szCs w:val="21"/>
+              </w:rPr>
+              <w:t xml:space="preserve">Guest Inviter</w:t>
+            </w:r>
+            <w:r>
+              <w:rPr>
+                <w:rFonts w:ascii="Calibri" w:cs="Calibri" w:eastAsia="Calibri" w:hAnsi="Calibri"/>
+                <w:color w:val="15202B"/>
+                <w:sz w:val="21"/>
+                <w:szCs w:val="21"/>
+              </w:rPr>
+              <w:t xml:space="preserve"> in Entra</w:t>
+            </w:r>
+          </w:p>
+        </w:tc>
+        <w:tc>
+          <w:tcPr>
+            <w:tcW w:type="dxa" w:w="3264"/>
+            <w:tcMar>
+              <w:top w:type="dxa" w:w="80"/>
+              <w:left w:type="dxa" w:w="110"/>
+              <w:bottom w:type="dxa" w:w="80"/>
+              <w:right w:type="dxa" w:w="110"/>
+            </w:tcMar>
+          </w:tcPr>
+          <w:p>
+            <w:pPr>
+              <w:spacing w:after="0" w:before="0"/>
+            </w:pPr>
+            <w:r>
+              <w:rPr>
+                <w:rFonts w:ascii="Calibri" w:cs="Calibri" w:eastAsia="Calibri" w:hAnsi="Calibri"/>
+                <w:color w:val="15202B"/>
+                <w:sz w:val="21"/>
+                <w:szCs w:val="21"/>
+              </w:rPr>
+              <w:t xml:space="preserve">Onboard Enovachem and Pharmco people herself</w:t>
+            </w:r>
+          </w:p>
+        </w:tc>
+      </w:tr>
+    </w:tbl>
+    <w:p>
+      <w:pPr>
+        <w:spacing w:after="160"/>
+      </w:pPr>
+    </w:p>
+    <w:p>
+      <w:pPr>
+        <w:spacing w:after="80" w:before="80" w:line="300"/>
+      </w:pPr>
+      <w:r>
+        <w:rPr>
+          <w:rFonts w:ascii="Calibri" w:cs="Calibri" w:eastAsia="Calibri" w:hAnsi="Calibri"/>
+          <w:color w:val="15202B"/>
+          <w:sz w:val="21"/>
+          <w:szCs w:val="21"/>
+        </w:rPr>
+        <w:t xml:space="preserve">If she is also going to administer the tenant day to day, </w:t>
+      </w:r>
+      <w:r>
+        <w:rPr>
+          <w:rFonts w:ascii="Calibri" w:cs="Calibri" w:eastAsia="Calibri" w:hAnsi="Calibri"/>
+          <w:b/>
+          <w:bCs/>
+          <w:color w:val="0F1D33"/>
+          <w:sz w:val="21"/>
+          <w:szCs w:val="21"/>
+        </w:rPr>
+        <w:t xml:space="preserve">User Administrator</w:t>
+      </w:r>
+      <w:r>
+        <w:rPr>
+          <w:rFonts w:ascii="Calibri" w:cs="Calibri" w:eastAsia="Calibri" w:hAnsi="Calibri"/>
+          <w:color w:val="15202B"/>
+          <w:sz w:val="21"/>
+          <w:szCs w:val="21"/>
+        </w:rPr>
+        <w:t xml:space="preserve"> covers people and passwords without the blast radius of Global Admin.</w:t>
+      </w:r>
+    </w:p>
+    <w:p>
+      <w:pPr>
+        <w:pBdr>
+          <w:left w:val="single" w:color="D6202A" w:sz="18"/>
+        </w:pBdr>
+        <w:shd w:fill="FDF4F4" w:val="clear"/>
+        <w:spacing w:after="160" w:before="160" w:line="300"/>
+        <w:ind w:left="200" w:right="200"/>
+      </w:pPr>
+      <w:r>
+        <w:rPr>
+          <w:rFonts w:ascii="Calibri" w:cs="Calibri" w:eastAsia="Calibri" w:hAnsi="Calibri"/>
+          <w:color w:val="15202B"/>
+          <w:sz w:val="21"/>
+          <w:szCs w:val="21"/>
+        </w:rPr>
+        <w:t xml:space="preserve">Whatever you decide: Microsoft's own guidance is that a tenant should have </w:t>
+      </w:r>
+      <w:r>
+        <w:rPr>
+          <w:rFonts w:ascii="Calibri" w:cs="Calibri" w:eastAsia="Calibri" w:hAnsi="Calibri"/>
+          <w:b/>
+          <w:bCs/>
+          <w:color w:val="0F1D33"/>
+          <w:sz w:val="21"/>
+          <w:szCs w:val="21"/>
+        </w:rPr>
+        <w:t xml:space="preserve">at least two</w:t>
+      </w:r>
+      <w:r>
+        <w:rPr>
+          <w:rFonts w:ascii="Calibri" w:cs="Calibri" w:eastAsia="Calibri" w:hAnsi="Calibri"/>
+          <w:color w:val="15202B"/>
+          <w:sz w:val="21"/>
+          <w:szCs w:val="21"/>
+        </w:rPr>
+        <w:t xml:space="preserve"> accounts able to recover it, and that they are not the same person's daily login. If you are currently the only Global Administrator, that is worth fixing regardless of this project.</w:t>
       </w:r>
     </w:p>
     <w:p>

</xml_diff>